<commit_message>
docs: add exam Q&A appendix and complexity comparison table to PDMOG summary
</commit_message>
<xml_diff>
--- a/PDMOG_summary_hebrew.docx
+++ b/PDMOG_summary_hebrew.docx
@@ -2404,6 +2404,1830 @@
           <w:rtl w:val="1"/>
         </w:rPr>
         <w:t>עיבוד מקדים בעיקר Õ(D); זמן לתו בעיקר Õ(plsc·δ(G_D)+pocc) או Õ(√(plsc·d)+pocc).</w:t>
+      </w:r>
+    </w:p>
+    <w:p>
+      <w:r>
+        <w:br w:type="page"/>
+      </w:r>
+    </w:p>
+    <w:p>
+      <w:pPr>
+        <w:pStyle w:val="Heading1"/>
+        <w:bidi/>
+        <w:jc w:val="right"/>
+      </w:pPr>
+      <w:r>
+        <w:rPr>
+          <w:rtl w:val="1"/>
+        </w:rPr>
+        <w:t>נספח א': שאלות ותשובות להכנה לבחינה בעל-פה</w:t>
+      </w:r>
+    </w:p>
+    <w:p>
+      <w:pPr>
+        <w:bidi/>
+        <w:jc w:val="right"/>
+      </w:pPr>
+      <w:r>
+        <w:rPr>
+          <w:b w:val="0"/>
+          <w:i/>
+          <w:rtl w:val="1"/>
+        </w:rPr>
+        <w:t>30 שאלות צפויות עם תשובות תמציתיות. כדאי לכסות אותן בקול רם לפני הבחינה.</w:t>
+      </w:r>
+    </w:p>
+    <w:p>
+      <w:pPr>
+        <w:pStyle w:val="Heading2"/>
+        <w:bidi/>
+        <w:jc w:val="right"/>
+      </w:pPr>
+      <w:r>
+        <w:rPr>
+          <w:rtl w:val="1"/>
+        </w:rPr>
+        <w:t>רמת הבנה כללית</w:t>
+      </w:r>
+    </w:p>
+    <w:p>
+      <w:pPr>
+        <w:bidi/>
+        <w:jc w:val="right"/>
+      </w:pPr>
+      <w:r>
+        <w:rPr>
+          <w:b/>
+          <w:color w:val="1F4E79"/>
+          <w:rtl w:val="1"/>
+        </w:rPr>
+        <w:t xml:space="preserve">ש: </w:t>
+      </w:r>
+      <w:r>
+        <w:rPr>
+          <w:rtl w:val="1"/>
+        </w:rPr>
+        <w:t>על מה המאמר בכמה מילים?</w:t>
+      </w:r>
+    </w:p>
+    <w:p>
+      <w:pPr>
+        <w:bidi/>
+        <w:jc w:val="right"/>
+      </w:pPr>
+      <w:r>
+        <w:rPr>
+          <w:b/>
+          <w:color w:val="2E744D"/>
+          <w:rtl w:val="1"/>
+        </w:rPr>
+        <w:t xml:space="preserve">ת: </w:t>
+      </w:r>
+      <w:r>
+        <w:rPr>
+          <w:rtl w:val="1"/>
+        </w:rPr>
+        <w:t>פתרון online לבעיית התאמת מילון עם רווח יחיד כשהתבניות מוצפנות במיפוי פרמטרי (ביֵקציה) — מודל של חתימות וירוסים מוצפנות ב-NIDS.</w:t>
+      </w:r>
+    </w:p>
+    <w:p>
+      <w:pPr>
+        <w:bidi/>
+        <w:jc w:val="right"/>
+      </w:pPr>
+      <w:r>
+        <w:rPr>
+          <w:b/>
+          <w:color w:val="1F4E79"/>
+          <w:rtl w:val="1"/>
+        </w:rPr>
+        <w:t xml:space="preserve">ש: </w:t>
+      </w:r>
+      <w:r>
+        <w:rPr>
+          <w:rtl w:val="1"/>
+        </w:rPr>
+        <w:t>מה ההבדל בין offline ל-online כאן, ולמה online חשוב?</w:t>
+      </w:r>
+    </w:p>
+    <w:p>
+      <w:pPr>
+        <w:bidi/>
+        <w:jc w:val="right"/>
+      </w:pPr>
+      <w:r>
+        <w:rPr>
+          <w:b/>
+          <w:color w:val="2E744D"/>
+          <w:rtl w:val="1"/>
+        </w:rPr>
+        <w:t xml:space="preserve">ת: </w:t>
+      </w:r>
+      <w:r>
+        <w:rPr>
+          <w:rtl w:val="1"/>
+        </w:rPr>
+        <w:t>ב-offline כל הטקסט נתון מראש; ב-online הטקסט מגיע תו-אחר-תו וחייבים לדווח לפני התו הבא. online מתאים ל-NIDS שבו התעבורה זורמת בזמן אמת.</w:t>
+      </w:r>
+    </w:p>
+    <w:p>
+      <w:pPr>
+        <w:bidi/>
+        <w:jc w:val="right"/>
+      </w:pPr>
+      <w:r>
+        <w:rPr>
+          <w:b/>
+          <w:color w:val="1F4E79"/>
+          <w:rtl w:val="1"/>
+        </w:rPr>
+        <w:t xml:space="preserve">ש: </w:t>
+      </w:r>
+      <w:r>
+        <w:rPr>
+          <w:rtl w:val="1"/>
+        </w:rPr>
+        <w:t>מהי התאמה פרמטרית (p-match) ולמה היא מייצגת הצפנה?</w:t>
+      </w:r>
+    </w:p>
+    <w:p>
+      <w:pPr>
+        <w:bidi/>
+        <w:jc w:val="right"/>
+      </w:pPr>
+      <w:r>
+        <w:rPr>
+          <w:b/>
+          <w:color w:val="2E744D"/>
+          <w:rtl w:val="1"/>
+        </w:rPr>
+        <w:t xml:space="preserve">ת: </w:t>
+      </w:r>
+      <w:r>
+        <w:rPr>
+          <w:rtl w:val="1"/>
+        </w:rPr>
+        <w:t>שתי מחרוזות באותו אורך הן p-match אם קיימת ביֵקציה על האלפבית הממפה אחת לשנייה. זה מודל של הצפנה בהחלפת תווים עקבית — לכן לא חשובים התווים אלא מבנה החזרות.</w:t>
+      </w:r>
+    </w:p>
+    <w:p>
+      <w:pPr>
+        <w:bidi/>
+        <w:jc w:val="right"/>
+      </w:pPr>
+      <w:r>
+        <w:rPr>
+          <w:b/>
+          <w:color w:val="1F4E79"/>
+          <w:rtl w:val="1"/>
+        </w:rPr>
+        <w:t xml:space="preserve">ש: </w:t>
+      </w:r>
+      <w:r>
+        <w:rPr>
+          <w:rtl w:val="1"/>
+        </w:rPr>
+        <w:t>למה מתמקדים ברווח יחיד ולא בכמה רווחים?</w:t>
+      </w:r>
+    </w:p>
+    <w:p>
+      <w:pPr>
+        <w:bidi/>
+        <w:jc w:val="right"/>
+      </w:pPr>
+      <w:r>
+        <w:rPr>
+          <w:b/>
+          <w:color w:val="2E744D"/>
+          <w:rtl w:val="1"/>
+        </w:rPr>
+        <w:t xml:space="preserve">ת: </w:t>
+      </w:r>
+      <w:r>
+        <w:rPr>
+          <w:rtl w:val="1"/>
+        </w:rPr>
+        <w:t>ניתוח חוקי SNORT: 77% מהתבניות עם לכל היותר רווח אחד, ו-44% מאלו עם רווחים מכילות בדיוק רווח אחד. רווח יחיד הוא צוואר הבקבוק האמיתי.</w:t>
+      </w:r>
+    </w:p>
+    <w:p>
+      <w:pPr>
+        <w:pStyle w:val="Heading2"/>
+        <w:bidi/>
+        <w:jc w:val="right"/>
+      </w:pPr>
+      <w:r>
+        <w:rPr>
+          <w:rtl w:val="1"/>
+        </w:rPr>
+        <w:t>מושגים ופרמטרים</w:t>
+      </w:r>
+    </w:p>
+    <w:p>
+      <w:pPr>
+        <w:bidi/>
+        <w:jc w:val="right"/>
+      </w:pPr>
+      <w:r>
+        <w:rPr>
+          <w:b/>
+          <w:color w:val="1F4E79"/>
+          <w:rtl w:val="1"/>
+        </w:rPr>
+        <w:t xml:space="preserve">ש: </w:t>
+      </w:r>
+      <w:r>
+        <w:rPr>
+          <w:rtl w:val="1"/>
+        </w:rPr>
+        <w:t>מהי פונקציית prev ולמה היא שימושית?</w:t>
+      </w:r>
+    </w:p>
+    <w:p>
+      <w:pPr>
+        <w:bidi/>
+        <w:jc w:val="right"/>
+      </w:pPr>
+      <w:r>
+        <w:rPr>
+          <w:b/>
+          <w:color w:val="2E744D"/>
+          <w:rtl w:val="1"/>
+        </w:rPr>
+        <w:t xml:space="preserve">ת: </w:t>
+      </w:r>
+      <w:r>
+        <w:rPr>
+          <w:rtl w:val="1"/>
+        </w:rPr>
+        <w:t>קידוד של מבנה ההתאמה הפרמטרית: לכל תו רושמים 0 אם זו הופעה ראשונה, אחרת המרחק להופעה הקודמת. לפי למה 1, שתי מחרוזות הן p-match אם ורק אם יש להן אותו prev — כך אפשר להחיל טכניקות התאמה רגילות.</w:t>
+      </w:r>
+    </w:p>
+    <w:p>
+      <w:pPr>
+        <w:bidi/>
+        <w:jc w:val="right"/>
+      </w:pPr>
+      <w:r>
+        <w:rPr>
+          <w:b/>
+          <w:color w:val="1F4E79"/>
+          <w:rtl w:val="1"/>
+        </w:rPr>
+        <w:t xml:space="preserve">ש: </w:t>
+      </w:r>
+      <w:r>
+        <w:rPr>
+          <w:rtl w:val="1"/>
+        </w:rPr>
+        <w:t>מהו הקושי המרכזי שהמאמר פותר?</w:t>
+      </w:r>
+    </w:p>
+    <w:p>
+      <w:pPr>
+        <w:bidi/>
+        <w:jc w:val="right"/>
+      </w:pPr>
+      <w:r>
+        <w:rPr>
+          <w:b/>
+          <w:color w:val="2E744D"/>
+          <w:rtl w:val="1"/>
+        </w:rPr>
+        <w:t xml:space="preserve">ת: </w:t>
+      </w:r>
+      <w:r>
+        <w:rPr>
+          <w:rtl w:val="1"/>
+        </w:rPr>
+        <w:t>prev אינה משמרת יחס סיומת: אם x סיומת של y, לא בהכרח prev(x) סיומת של prev(y). זה שובר טריק שהיה קריטי ב-DMOG. הפתרון: גרף עזר pG וסריקת BFS.</w:t>
+      </w:r>
+    </w:p>
+    <w:p>
+      <w:pPr>
+        <w:bidi/>
+        <w:jc w:val="right"/>
+      </w:pPr>
+      <w:r>
+        <w:rPr>
+          <w:b/>
+          <w:color w:val="1F4E79"/>
+          <w:rtl w:val="1"/>
+        </w:rPr>
+        <w:t xml:space="preserve">ש: </w:t>
+      </w:r>
+      <w:r>
+        <w:rPr>
+          <w:rtl w:val="1"/>
+        </w:rPr>
+        <w:t>מהו plsc ומדוע הוא חשוב?</w:t>
+      </w:r>
+    </w:p>
+    <w:p>
+      <w:pPr>
+        <w:bidi/>
+        <w:jc w:val="right"/>
+      </w:pPr>
+      <w:r>
+        <w:rPr>
+          <w:b/>
+          <w:color w:val="2E744D"/>
+          <w:rtl w:val="1"/>
+        </w:rPr>
+        <w:t xml:space="preserve">ת: </w:t>
+      </w:r>
+      <w:r>
+        <w:rPr>
+          <w:rtl w:val="1"/>
+        </w:rPr>
+        <w:t>אורך השרשרת הארוכה ביותר של תת-תבניות שכל אחת p-suffix של הבאה. לכל היותר plsc תת-תבניות "מגיעות" עקב תו בודד. תיאורטית עד d, בפועל קטן.</w:t>
+      </w:r>
+    </w:p>
+    <w:p>
+      <w:pPr>
+        <w:bidi/>
+        <w:jc w:val="right"/>
+      </w:pPr>
+      <w:r>
+        <w:rPr>
+          <w:b/>
+          <w:color w:val="1F4E79"/>
+          <w:rtl w:val="1"/>
+        </w:rPr>
+        <w:t xml:space="preserve">ש: </w:t>
+      </w:r>
+      <w:r>
+        <w:rPr>
+          <w:rtl w:val="1"/>
+        </w:rPr>
+        <w:t>מהו δ(G_D) (ניוון) ומה ערכו בפועל?</w:t>
+      </w:r>
+    </w:p>
+    <w:p>
+      <w:pPr>
+        <w:bidi/>
+        <w:jc w:val="right"/>
+      </w:pPr>
+      <w:r>
+        <w:rPr>
+          <w:b/>
+          <w:color w:val="2E744D"/>
+          <w:rtl w:val="1"/>
+        </w:rPr>
+        <w:t xml:space="preserve">ת: </w:t>
+      </w:r>
+      <w:r>
+        <w:rPr>
+          <w:rtl w:val="1"/>
+        </w:rPr>
+        <w:t>הדרגה המינימלית הגדולה ביותר בכל תת-גרף של גרף הייצוג. ב-SNORT ≤ 5. במקרה הגרוע O(√d) לגרף פשוט, והרבה יותר למולטי-גרף לא-אחיד.</w:t>
+      </w:r>
+    </w:p>
+    <w:p>
+      <w:pPr>
+        <w:bidi/>
+        <w:jc w:val="right"/>
+      </w:pPr>
+      <w:r>
+        <w:rPr>
+          <w:b/>
+          <w:color w:val="1F4E79"/>
+          <w:rtl w:val="1"/>
+        </w:rPr>
+        <w:t xml:space="preserve">ש: </w:t>
+      </w:r>
+      <w:r>
+        <w:rPr>
+          <w:rtl w:val="1"/>
+        </w:rPr>
+        <w:t>למה G_D הוא מולטי-גרף במקרה הלא-אחיד?</w:t>
+      </w:r>
+    </w:p>
+    <w:p>
+      <w:pPr>
+        <w:bidi/>
+        <w:jc w:val="right"/>
+      </w:pPr>
+      <w:r>
+        <w:rPr>
+          <w:b/>
+          <w:color w:val="2E744D"/>
+          <w:rtl w:val="1"/>
+        </w:rPr>
+        <w:t xml:space="preserve">ת: </w:t>
+      </w:r>
+      <w:r>
+        <w:rPr>
+          <w:rtl w:val="1"/>
+        </w:rPr>
+        <w:t>כי אותו זוג תת-תבניות (u,v) עם גבולות רווח שונים מייצג תבניות שונות — ולכן כמה קשתות בין אותו זוג קודקודים.</w:t>
+      </w:r>
+    </w:p>
+    <w:p>
+      <w:pPr>
+        <w:bidi/>
+        <w:jc w:val="right"/>
+      </w:pPr>
+      <w:r>
+        <w:rPr>
+          <w:b/>
+          <w:color w:val="1F4E79"/>
+          <w:rtl w:val="1"/>
+        </w:rPr>
+        <w:t xml:space="preserve">ש: </w:t>
+      </w:r>
+      <w:r>
+        <w:rPr>
+          <w:rtl w:val="1"/>
+        </w:rPr>
+        <w:t>מהו פרמטר הסנכרון M ולמה צריך אותו?</w:t>
+      </w:r>
+    </w:p>
+    <w:p>
+      <w:pPr>
+        <w:bidi/>
+        <w:jc w:val="right"/>
+      </w:pPr>
+      <w:r>
+        <w:rPr>
+          <w:b/>
+          <w:color w:val="2E744D"/>
+          <w:rtl w:val="1"/>
+        </w:rPr>
+        <w:t xml:space="preserve">ת: </w:t>
+      </w:r>
+      <w:r>
+        <w:rPr>
+          <w:rtl w:val="1"/>
+        </w:rPr>
+        <w:t>אורך תת-התבנית הימנית הארוכה ביותר. מעכבים מחיקת קודקוד ב-M−1 יחידות אחרי גבול הרווח, כדי שמספר המחיקות ליחידת זמן יישאר חסום ב-plsc.</w:t>
+      </w:r>
+    </w:p>
+    <w:p>
+      <w:pPr>
+        <w:pStyle w:val="Heading2"/>
+        <w:bidi/>
+        <w:jc w:val="right"/>
+      </w:pPr>
+      <w:r>
+        <w:rPr>
+          <w:rtl w:val="1"/>
+        </w:rPr>
+        <w:t>אלגוריתמים</w:t>
+      </w:r>
+    </w:p>
+    <w:p>
+      <w:pPr>
+        <w:bidi/>
+        <w:jc w:val="right"/>
+      </w:pPr>
+      <w:r>
+        <w:rPr>
+          <w:b/>
+          <w:color w:val="1F4E79"/>
+          <w:rtl w:val="1"/>
+        </w:rPr>
+        <w:t xml:space="preserve">ש: </w:t>
+      </w:r>
+      <w:r>
+        <w:rPr>
+          <w:rtl w:val="1"/>
+        </w:rPr>
+        <w:t>מהו רעיון כיווני הגרף (graph orientation)?</w:t>
+      </w:r>
+    </w:p>
+    <w:p>
+      <w:pPr>
+        <w:bidi/>
+        <w:jc w:val="right"/>
+      </w:pPr>
+      <w:r>
+        <w:rPr>
+          <w:b/>
+          <w:color w:val="2E744D"/>
+          <w:rtl w:val="1"/>
+        </w:rPr>
+        <w:t xml:space="preserve">ת: </w:t>
+      </w:r>
+      <w:r>
+        <w:rPr>
+          <w:rtl w:val="1"/>
+        </w:rPr>
+        <w:t>מכוונים את הגרף כך שלכל קודקוד דרגת-יציאה ≤ δ(G_D), ומחלקים "אחריות" בין קצוות הקשת. כך העבודה ליחידת זמן ~ plsc·δ(G_D). יעיל כשהניוון קטן.</w:t>
+      </w:r>
+    </w:p>
+    <w:p>
+      <w:pPr>
+        <w:bidi/>
+        <w:jc w:val="right"/>
+      </w:pPr>
+      <w:r>
+        <w:rPr>
+          <w:b/>
+          <w:color w:val="1F4E79"/>
+          <w:rtl w:val="1"/>
+        </w:rPr>
+        <w:t xml:space="preserve">ש: </w:t>
+      </w:r>
+      <w:r>
+        <w:rPr>
+          <w:rtl w:val="1"/>
+        </w:rPr>
+        <w:t>מתי משתמשים בכיווּן סף (threshold) ומה הרעיון?</w:t>
+      </w:r>
+    </w:p>
+    <w:p>
+      <w:pPr>
+        <w:bidi/>
+        <w:jc w:val="right"/>
+      </w:pPr>
+      <w:r>
+        <w:rPr>
+          <w:b/>
+          <w:color w:val="2E744D"/>
+          <w:rtl w:val="1"/>
+        </w:rPr>
+        <w:t xml:space="preserve">ת: </w:t>
+      </w:r>
+      <w:r>
+        <w:rPr>
+          <w:rtl w:val="1"/>
+        </w:rPr>
+        <w:t>כשהגרף צפוף (δ≥√d או plsc גדול). מחלקים קודקודים לכבדים/קלים; קשת שנוגעת בקל מכוונת ממנו; קשתות בין שני כבדים מטופלות בסריקת אצווה. מוריד את הגורם ל-√(plsc·d).</w:t>
+      </w:r>
+    </w:p>
+    <w:p>
+      <w:pPr>
+        <w:bidi/>
+        <w:jc w:val="right"/>
+      </w:pPr>
+      <w:r>
+        <w:rPr>
+          <w:b/>
+          <w:color w:val="1F4E79"/>
+          <w:rtl w:val="1"/>
+        </w:rPr>
+        <w:t xml:space="preserve">ש: </w:t>
+      </w:r>
+      <w:r>
+        <w:rPr>
+          <w:rtl w:val="1"/>
+        </w:rPr>
+        <w:t>מה תפקיד הגרף pG והגרף phG?</w:t>
+      </w:r>
+    </w:p>
+    <w:p>
+      <w:pPr>
+        <w:bidi/>
+        <w:jc w:val="right"/>
+      </w:pPr>
+      <w:r>
+        <w:rPr>
+          <w:b/>
+          <w:color w:val="2E744D"/>
+          <w:rtl w:val="1"/>
+        </w:rPr>
+        <w:t xml:space="preserve">ת: </w:t>
+      </w:r>
+      <w:r>
+        <w:rPr>
+          <w:rtl w:val="1"/>
+        </w:rPr>
+        <w:t>pG מקודד יחסי p-סיומת בין כל תת-התבניות (פותר את בעיית prev). phG הוא אותו רעיון אך רק בין הקודקודים הכבדים, ומשמש במקרה הצפוף.</w:t>
+      </w:r>
+    </w:p>
+    <w:p>
+      <w:pPr>
+        <w:bidi/>
+        <w:jc w:val="right"/>
+      </w:pPr>
+      <w:r>
+        <w:rPr>
+          <w:b/>
+          <w:color w:val="1F4E79"/>
+          <w:rtl w:val="1"/>
+        </w:rPr>
+        <w:t xml:space="preserve">ש: </w:t>
+      </w:r>
+      <w:r>
+        <w:rPr>
+          <w:rtl w:val="1"/>
+        </w:rPr>
+        <w:t>מהי תמורת ההתאמה (matching permutation) ולמה צריך אותה?</w:t>
+      </w:r>
+    </w:p>
+    <w:p>
+      <w:pPr>
+        <w:bidi/>
+        <w:jc w:val="right"/>
+      </w:pPr>
+      <w:r>
+        <w:rPr>
+          <w:b/>
+          <w:color w:val="2E744D"/>
+          <w:rtl w:val="1"/>
+        </w:rPr>
+        <w:t xml:space="preserve">ת: </w:t>
+      </w:r>
+      <w:r>
+        <w:rPr>
+          <w:rtl w:val="1"/>
+        </w:rPr>
+        <w:t>ה-pAC אומר שיש p-match אך לא איזו ביֵקציה. πu,t הוא מערך באורך |Σ| שמתאר את הביֵקציה. חיוני בעיקר ל-strict, שבו צריך להשוות שהביֵקציות זהות.</w:t>
+      </w:r>
+    </w:p>
+    <w:p>
+      <w:pPr>
+        <w:bidi/>
+        <w:jc w:val="right"/>
+      </w:pPr>
+      <w:r>
+        <w:rPr>
+          <w:b/>
+          <w:color w:val="1F4E79"/>
+          <w:rtl w:val="1"/>
+        </w:rPr>
+        <w:t xml:space="preserve">ש: </w:t>
+      </w:r>
+      <w:r>
+        <w:rPr>
+          <w:rtl w:val="1"/>
+        </w:rPr>
+        <w:t>איך פותרים את strict במקרה האחיד?</w:t>
+      </w:r>
+    </w:p>
+    <w:p>
+      <w:pPr>
+        <w:bidi/>
+        <w:jc w:val="right"/>
+      </w:pPr>
+      <w:r>
+        <w:rPr>
+          <w:b/>
+          <w:color w:val="2E744D"/>
+          <w:rtl w:val="1"/>
+        </w:rPr>
+        <w:t xml:space="preserve">ת: </w:t>
+      </w:r>
+      <w:r>
+        <w:rPr>
+          <w:rtl w:val="1"/>
+        </w:rPr>
+        <w:t>עצי תמורות (permutation trees) ממומשים כ-y-fast trie: לכל קודקוד עץ של התמורות הפעילות. כשמגיע v מחפשים את אותה תמורה בדיוק — התאמה = ביֵקציה זהה = strict.</w:t>
+      </w:r>
+    </w:p>
+    <w:p>
+      <w:pPr>
+        <w:bidi/>
+        <w:jc w:val="right"/>
+      </w:pPr>
+      <w:r>
+        <w:rPr>
+          <w:b/>
+          <w:color w:val="1F4E79"/>
+          <w:rtl w:val="1"/>
+        </w:rPr>
+        <w:t xml:space="preserve">ש: </w:t>
+      </w:r>
+      <w:r>
+        <w:rPr>
+          <w:rtl w:val="1"/>
+        </w:rPr>
+        <w:t>איך פותרים את strict במקרה הלא-אחיד?</w:t>
+      </w:r>
+    </w:p>
+    <w:p>
+      <w:pPr>
+        <w:bidi/>
+        <w:jc w:val="right"/>
+      </w:pPr>
+      <w:r>
+        <w:rPr>
+          <w:b/>
+          <w:color w:val="2E744D"/>
+          <w:rtl w:val="1"/>
+        </w:rPr>
+        <w:t xml:space="preserve">ת: </w:t>
+      </w:r>
+      <w:r>
+        <w:rPr>
+          <w:rtl w:val="1"/>
+        </w:rPr>
+        <w:t>ממספרים כל תמורה למספר ייחודי num(π) בבסיס |Σ|, וכך משלבים אותה כקואורדינטה בשאילתות טווח אורתוגונליות (3-ממד) שבודקות גם זמן וגם זהות תמורה.</w:t>
+      </w:r>
+    </w:p>
+    <w:p>
+      <w:pPr>
+        <w:pStyle w:val="Heading2"/>
+        <w:bidi/>
+        <w:jc w:val="right"/>
+      </w:pPr>
+      <w:r>
+        <w:rPr>
+          <w:rtl w:val="1"/>
+        </w:rPr>
+        <w:t>סיבוכיות והקשר רחב</w:t>
+      </w:r>
+    </w:p>
+    <w:p>
+      <w:pPr>
+        <w:bidi/>
+        <w:jc w:val="right"/>
+      </w:pPr>
+      <w:r>
+        <w:rPr>
+          <w:b/>
+          <w:color w:val="1F4E79"/>
+          <w:rtl w:val="1"/>
+        </w:rPr>
+        <w:t xml:space="preserve">ש: </w:t>
+      </w:r>
+      <w:r>
+        <w:rPr>
+          <w:rtl w:val="1"/>
+        </w:rPr>
+        <w:t>מה זמן השאילתה לתו במקרה הדליל (משפט 1)?</w:t>
+      </w:r>
+    </w:p>
+    <w:p>
+      <w:pPr>
+        <w:bidi/>
+        <w:jc w:val="right"/>
+      </w:pPr>
+      <w:r>
+        <w:rPr>
+          <w:b/>
+          <w:color w:val="2E744D"/>
+          <w:rtl w:val="1"/>
+        </w:rPr>
+        <w:t xml:space="preserve">ת: </w:t>
+      </w:r>
+      <w:r>
+        <w:rPr>
+          <w:rtl w:val="1"/>
+        </w:rPr>
+        <w:t>Õ(δ(G_D)·plsc + plsc·max{|Σ|,M} + pocc), עם עיבוד מקדים Õ(D).</w:t>
+      </w:r>
+    </w:p>
+    <w:p>
+      <w:pPr>
+        <w:bidi/>
+        <w:jc w:val="right"/>
+      </w:pPr>
+      <w:r>
+        <w:rPr>
+          <w:b/>
+          <w:color w:val="1F4E79"/>
+          <w:rtl w:val="1"/>
+        </w:rPr>
+        <w:t xml:space="preserve">ש: </w:t>
+      </w:r>
+      <w:r>
+        <w:rPr>
+          <w:rtl w:val="1"/>
+        </w:rPr>
+        <w:t>מה זמן השאילתה במקרה הצפוף (משפט 2)?</w:t>
+      </w:r>
+    </w:p>
+    <w:p>
+      <w:pPr>
+        <w:bidi/>
+        <w:jc w:val="right"/>
+      </w:pPr>
+      <w:r>
+        <w:rPr>
+          <w:b/>
+          <w:color w:val="2E744D"/>
+          <w:rtl w:val="1"/>
+        </w:rPr>
+        <w:t xml:space="preserve">ת: </w:t>
+      </w:r>
+      <w:r>
+        <w:rPr>
+          <w:rtl w:val="1"/>
+        </w:rPr>
+        <w:t>O(plsc·max{|Σ|,M} + √(plsc·d) + pocc) — הגורם √(plsc·d) מחליף את plsc·δ(G_D).</w:t>
+      </w:r>
+    </w:p>
+    <w:p>
+      <w:pPr>
+        <w:bidi/>
+        <w:jc w:val="right"/>
+      </w:pPr>
+      <w:r>
+        <w:rPr>
+          <w:b/>
+          <w:color w:val="1F4E79"/>
+          <w:rtl w:val="1"/>
+        </w:rPr>
+        <w:t xml:space="preserve">ש: </w:t>
+      </w:r>
+      <w:r>
+        <w:rPr>
+          <w:rtl w:val="1"/>
+        </w:rPr>
+        <w:t>מדוע האלגוריתמים מהירים בפועל למרות חסמי המקרה הגרוע?</w:t>
+      </w:r>
+    </w:p>
+    <w:p>
+      <w:pPr>
+        <w:bidi/>
+        <w:jc w:val="right"/>
+      </w:pPr>
+      <w:r>
+        <w:rPr>
+          <w:b/>
+          <w:color w:val="2E744D"/>
+          <w:rtl w:val="1"/>
+        </w:rPr>
+        <w:t xml:space="preserve">ת: </w:t>
+      </w:r>
+      <w:r>
+        <w:rPr>
+          <w:rtl w:val="1"/>
+        </w:rPr>
+        <w:t>כי plsc ו-δ(G_D) קטנים בקלטים אמיתיים (≤5 ב-SNORT), והסיבוכיות מנוסחת במונחיהם.</w:t>
+      </w:r>
+    </w:p>
+    <w:p>
+      <w:pPr>
+        <w:bidi/>
+        <w:jc w:val="right"/>
+      </w:pPr>
+      <w:r>
+        <w:rPr>
+          <w:b/>
+          <w:color w:val="1F4E79"/>
+          <w:rtl w:val="1"/>
+        </w:rPr>
+        <w:t xml:space="preserve">ש: </w:t>
+      </w:r>
+      <w:r>
+        <w:rPr>
+          <w:rtl w:val="1"/>
+        </w:rPr>
+        <w:t>מה הקשר לחסמים תחתונים?</w:t>
+      </w:r>
+    </w:p>
+    <w:p>
+      <w:pPr>
+        <w:bidi/>
+        <w:jc w:val="right"/>
+      </w:pPr>
+      <w:r>
+        <w:rPr>
+          <w:b/>
+          <w:color w:val="2E744D"/>
+          <w:rtl w:val="1"/>
+        </w:rPr>
+        <w:t xml:space="preserve">ת: </w:t>
+      </w:r>
+      <w:r>
+        <w:rPr>
+          <w:rtl w:val="1"/>
+        </w:rPr>
+        <w:t>התוצאות מקבילות ל-DMOG וכמעט תואמות את החסמים התחתונים מ-[7] (מבוססי השערת 3SUM). כל מופע DMOG הוא גם PDMOG, לכן החסמים חלים.</w:t>
+      </w:r>
+    </w:p>
+    <w:p>
+      <w:pPr>
+        <w:bidi/>
+        <w:jc w:val="right"/>
+      </w:pPr>
+      <w:r>
+        <w:rPr>
+          <w:b/>
+          <w:color w:val="1F4E79"/>
+          <w:rtl w:val="1"/>
+        </w:rPr>
+        <w:t xml:space="preserve">ש: </w:t>
+      </w:r>
+      <w:r>
+        <w:rPr>
+          <w:rtl w:val="1"/>
+        </w:rPr>
+        <w:t>מהי התרומה הכי "טכנית" של המאמר?</w:t>
+      </w:r>
+    </w:p>
+    <w:p>
+      <w:pPr>
+        <w:bidi/>
+        <w:jc w:val="right"/>
+      </w:pPr>
+      <w:r>
+        <w:rPr>
+          <w:b/>
+          <w:color w:val="2E744D"/>
+          <w:rtl w:val="1"/>
+        </w:rPr>
+        <w:t xml:space="preserve">ת: </w:t>
+      </w:r>
+      <w:r>
+        <w:rPr>
+          <w:rtl w:val="1"/>
+        </w:rPr>
+        <w:t>עקיפת העובדה שסיומות פרמטריות אינן יוצרות שרשרת סיומות, באמצעות מבני pG/phG, תוך שמירה על אותם חסמי סיבוכיות כמו DMOG.</w:t>
+      </w:r>
+    </w:p>
+    <w:p>
+      <w:r>
+        <w:br w:type="page"/>
+      </w:r>
+    </w:p>
+    <w:p>
+      <w:pPr>
+        <w:pStyle w:val="Heading1"/>
+        <w:bidi/>
+        <w:jc w:val="right"/>
+      </w:pPr>
+      <w:r>
+        <w:rPr>
+          <w:rtl w:val="1"/>
+        </w:rPr>
+        <w:t>נספח ב': טבלת סיבוכיות מרוכזת</w:t>
+      </w:r>
+    </w:p>
+    <w:p>
+      <w:pPr>
+        <w:bidi/>
+        <w:jc w:val="right"/>
+      </w:pPr>
+      <w:r>
+        <w:rPr>
+          <w:b w:val="0"/>
+          <w:i/>
+          <w:rtl w:val="1"/>
+        </w:rPr>
+        <w:t>סיכום ארבעת המשפטים במבט אחד. כל הזמנים הם "לכל תו בטקסט". pocc = גודל הפלט.</w:t>
+      </w:r>
+    </w:p>
+    <w:tbl>
+      <w:tblPr>
+        <w:tblStyle w:val="LightGrid-Accent1"/>
+        <w:tblW w:type="auto" w:w="0"/>
+        <w:jc w:val="right"/>
+        <w:tblLook w:firstColumn="1" w:firstRow="1" w:lastColumn="0" w:lastRow="0" w:noHBand="0" w:noVBand="1" w:val="04A0"/>
+        <w:bidiVisual/>
+      </w:tblPr>
+      <w:tblGrid>
+        <w:gridCol w:w="1728"/>
+        <w:gridCol w:w="1728"/>
+        <w:gridCol w:w="1728"/>
+        <w:gridCol w:w="1728"/>
+        <w:gridCol w:w="1728"/>
+      </w:tblGrid>
+      <w:tr>
+        <w:tc>
+          <w:tcPr>
+            <w:tcW w:type="dxa" w:w="1728"/>
+          </w:tcPr>
+          <w:p>
+            <w:pPr>
+              <w:bidi/>
+              <w:jc w:val="right"/>
+            </w:pPr>
+            <w:r>
+              <w:rPr>
+                <w:rtl w:val="1"/>
+              </w:rPr>
+            </w:r>
+            <w:r>
+              <w:rPr>
+                <w:b/>
+                <w:sz w:val="17"/>
+                <w:rtl w:val="1"/>
+              </w:rPr>
+              <w:t>#</w:t>
+            </w:r>
+          </w:p>
+        </w:tc>
+        <w:tc>
+          <w:tcPr>
+            <w:tcW w:type="dxa" w:w="1728"/>
+          </w:tcPr>
+          <w:p>
+            <w:pPr>
+              <w:bidi/>
+              <w:jc w:val="right"/>
+            </w:pPr>
+            <w:r>
+              <w:rPr>
+                <w:rtl w:val="1"/>
+              </w:rPr>
+            </w:r>
+            <w:r>
+              <w:rPr>
+                <w:b/>
+                <w:sz w:val="17"/>
+                <w:rtl w:val="1"/>
+              </w:rPr>
+              <w:t>בעיה / מקרה</w:t>
+            </w:r>
+          </w:p>
+        </w:tc>
+        <w:tc>
+          <w:tcPr>
+            <w:tcW w:type="dxa" w:w="1728"/>
+          </w:tcPr>
+          <w:p>
+            <w:pPr>
+              <w:bidi/>
+              <w:jc w:val="right"/>
+            </w:pPr>
+            <w:r>
+              <w:rPr>
+                <w:rtl w:val="1"/>
+              </w:rPr>
+            </w:r>
+            <w:r>
+              <w:rPr>
+                <w:b/>
+                <w:sz w:val="17"/>
+                <w:rtl w:val="1"/>
+              </w:rPr>
+              <w:t>עיבוד מקדים</w:t>
+            </w:r>
+          </w:p>
+        </w:tc>
+        <w:tc>
+          <w:tcPr>
+            <w:tcW w:type="dxa" w:w="1728"/>
+          </w:tcPr>
+          <w:p>
+            <w:pPr>
+              <w:bidi/>
+              <w:jc w:val="right"/>
+            </w:pPr>
+            <w:r>
+              <w:rPr>
+                <w:rtl w:val="1"/>
+              </w:rPr>
+            </w:r>
+            <w:r>
+              <w:rPr>
+                <w:b/>
+                <w:sz w:val="17"/>
+                <w:rtl w:val="1"/>
+              </w:rPr>
+              <w:t>זמן לכל תו</w:t>
+            </w:r>
+          </w:p>
+        </w:tc>
+        <w:tc>
+          <w:tcPr>
+            <w:tcW w:type="dxa" w:w="1728"/>
+          </w:tcPr>
+          <w:p>
+            <w:pPr>
+              <w:bidi/>
+              <w:jc w:val="right"/>
+            </w:pPr>
+            <w:r>
+              <w:rPr>
+                <w:rtl w:val="1"/>
+              </w:rPr>
+            </w:r>
+            <w:r>
+              <w:rPr>
+                <w:b/>
+                <w:sz w:val="17"/>
+                <w:rtl w:val="1"/>
+              </w:rPr>
+              <w:t>מקום</w:t>
+            </w:r>
+          </w:p>
+        </w:tc>
+      </w:tr>
+      <w:tr>
+        <w:tc>
+          <w:tcPr>
+            <w:tcW w:type="dxa" w:w="1728"/>
+          </w:tcPr>
+          <w:p>
+            <w:pPr>
+              <w:bidi/>
+              <w:jc w:val="right"/>
+            </w:pPr>
+            <w:r>
+              <w:rPr>
+                <w:rtl w:val="1"/>
+              </w:rPr>
+            </w:r>
+            <w:r>
+              <w:rPr>
+                <w:sz w:val="17"/>
+                <w:rtl w:val="1"/>
+              </w:rPr>
+              <w:t>משפט 1</w:t>
+            </w:r>
+          </w:p>
+        </w:tc>
+        <w:tc>
+          <w:tcPr>
+            <w:tcW w:type="dxa" w:w="1728"/>
+          </w:tcPr>
+          <w:p>
+            <w:pPr>
+              <w:bidi/>
+              <w:jc w:val="right"/>
+            </w:pPr>
+            <w:r>
+              <w:rPr>
+                <w:rtl w:val="1"/>
+              </w:rPr>
+            </w:r>
+            <w:r>
+              <w:rPr>
+                <w:sz w:val="17"/>
+                <w:rtl w:val="1"/>
+              </w:rPr>
+              <w:t>PDMOG דליל, אחיד</w:t>
+            </w:r>
+          </w:p>
+        </w:tc>
+        <w:tc>
+          <w:tcPr>
+            <w:tcW w:type="dxa" w:w="1728"/>
+          </w:tcPr>
+          <w:p>
+            <w:pPr>
+              <w:bidi/>
+              <w:jc w:val="right"/>
+            </w:pPr>
+            <w:r>
+              <w:rPr>
+                <w:rtl w:val="1"/>
+              </w:rPr>
+            </w:r>
+            <w:r>
+              <w:rPr>
+                <w:sz w:val="17"/>
+                <w:rtl w:val="1"/>
+              </w:rPr>
+              <w:t>Õ(D)</w:t>
+            </w:r>
+          </w:p>
+        </w:tc>
+        <w:tc>
+          <w:tcPr>
+            <w:tcW w:type="dxa" w:w="1728"/>
+          </w:tcPr>
+          <w:p>
+            <w:pPr>
+              <w:bidi/>
+              <w:jc w:val="right"/>
+            </w:pPr>
+            <w:r>
+              <w:rPr>
+                <w:rtl w:val="1"/>
+              </w:rPr>
+            </w:r>
+            <w:r>
+              <w:rPr>
+                <w:sz w:val="17"/>
+                <w:rtl w:val="1"/>
+              </w:rPr>
+              <w:t>Õ(δ·plsc + plsc·max{|Σ|,M} + pocc)</w:t>
+            </w:r>
+          </w:p>
+        </w:tc>
+        <w:tc>
+          <w:tcPr>
+            <w:tcW w:type="dxa" w:w="1728"/>
+          </w:tcPr>
+          <w:p>
+            <w:pPr>
+              <w:bidi/>
+              <w:jc w:val="right"/>
+            </w:pPr>
+            <w:r>
+              <w:rPr>
+                <w:rtl w:val="1"/>
+              </w:rPr>
+            </w:r>
+            <w:r>
+              <w:rPr>
+                <w:sz w:val="17"/>
+                <w:rtl w:val="1"/>
+              </w:rPr>
+              <w:t>Õ(D + plsc(β+M))</w:t>
+            </w:r>
+          </w:p>
+        </w:tc>
+      </w:tr>
+      <w:tr>
+        <w:tc>
+          <w:tcPr>
+            <w:tcW w:type="dxa" w:w="1728"/>
+          </w:tcPr>
+          <w:p>
+            <w:pPr>
+              <w:bidi/>
+              <w:jc w:val="right"/>
+            </w:pPr>
+            <w:r>
+              <w:rPr>
+                <w:rtl w:val="1"/>
+              </w:rPr>
+            </w:r>
+            <w:r>
+              <w:rPr>
+                <w:sz w:val="17"/>
+                <w:rtl w:val="1"/>
+              </w:rPr>
+              <w:t>משפט 1</w:t>
+            </w:r>
+          </w:p>
+        </w:tc>
+        <w:tc>
+          <w:tcPr>
+            <w:tcW w:type="dxa" w:w="1728"/>
+          </w:tcPr>
+          <w:p>
+            <w:pPr>
+              <w:bidi/>
+              <w:jc w:val="right"/>
+            </w:pPr>
+            <w:r>
+              <w:rPr>
+                <w:rtl w:val="1"/>
+              </w:rPr>
+            </w:r>
+            <w:r>
+              <w:rPr>
+                <w:sz w:val="17"/>
+                <w:rtl w:val="1"/>
+              </w:rPr>
+              <w:t>PDMOG דליל, לא-אחיד</w:t>
+            </w:r>
+          </w:p>
+        </w:tc>
+        <w:tc>
+          <w:tcPr>
+            <w:tcW w:type="dxa" w:w="1728"/>
+          </w:tcPr>
+          <w:p>
+            <w:pPr>
+              <w:bidi/>
+              <w:jc w:val="right"/>
+            </w:pPr>
+            <w:r>
+              <w:rPr>
+                <w:rtl w:val="1"/>
+              </w:rPr>
+            </w:r>
+            <w:r>
+              <w:rPr>
+                <w:sz w:val="17"/>
+                <w:rtl w:val="1"/>
+              </w:rPr>
+              <w:t>Õ(D)</w:t>
+            </w:r>
+          </w:p>
+        </w:tc>
+        <w:tc>
+          <w:tcPr>
+            <w:tcW w:type="dxa" w:w="1728"/>
+          </w:tcPr>
+          <w:p>
+            <w:pPr>
+              <w:bidi/>
+              <w:jc w:val="right"/>
+            </w:pPr>
+            <w:r>
+              <w:rPr>
+                <w:rtl w:val="1"/>
+              </w:rPr>
+            </w:r>
+            <w:r>
+              <w:rPr>
+                <w:sz w:val="17"/>
+                <w:rtl w:val="1"/>
+              </w:rPr>
+              <w:t>Õ(plsc·δ + plsc·max{|Σ|,M} + pocc)</w:t>
+            </w:r>
+          </w:p>
+        </w:tc>
+        <w:tc>
+          <w:tcPr>
+            <w:tcW w:type="dxa" w:w="1728"/>
+          </w:tcPr>
+          <w:p>
+            <w:pPr>
+              <w:bidi/>
+              <w:jc w:val="right"/>
+            </w:pPr>
+            <w:r>
+              <w:rPr>
+                <w:rtl w:val="1"/>
+              </w:rPr>
+            </w:r>
+            <w:r>
+              <w:rPr>
+                <w:sz w:val="17"/>
+                <w:rtl w:val="1"/>
+              </w:rPr>
+              <w:t>Õ(D + plsc·δ(β*−α*+M) + plsc·α*)</w:t>
+            </w:r>
+          </w:p>
+        </w:tc>
+      </w:tr>
+      <w:tr>
+        <w:tc>
+          <w:tcPr>
+            <w:tcW w:type="dxa" w:w="1728"/>
+          </w:tcPr>
+          <w:p>
+            <w:pPr>
+              <w:bidi/>
+              <w:jc w:val="right"/>
+            </w:pPr>
+            <w:r>
+              <w:rPr>
+                <w:rtl w:val="1"/>
+              </w:rPr>
+            </w:r>
+            <w:r>
+              <w:rPr>
+                <w:sz w:val="17"/>
+                <w:rtl w:val="1"/>
+              </w:rPr>
+              <w:t>משפט 2</w:t>
+            </w:r>
+          </w:p>
+        </w:tc>
+        <w:tc>
+          <w:tcPr>
+            <w:tcW w:type="dxa" w:w="1728"/>
+          </w:tcPr>
+          <w:p>
+            <w:pPr>
+              <w:bidi/>
+              <w:jc w:val="right"/>
+            </w:pPr>
+            <w:r>
+              <w:rPr>
+                <w:rtl w:val="1"/>
+              </w:rPr>
+            </w:r>
+            <w:r>
+              <w:rPr>
+                <w:sz w:val="17"/>
+                <w:rtl w:val="1"/>
+              </w:rPr>
+              <w:t>PDMOG צפוף, אחיד</w:t>
+            </w:r>
+          </w:p>
+        </w:tc>
+        <w:tc>
+          <w:tcPr>
+            <w:tcW w:type="dxa" w:w="1728"/>
+          </w:tcPr>
+          <w:p>
+            <w:pPr>
+              <w:bidi/>
+              <w:jc w:val="right"/>
+            </w:pPr>
+            <w:r>
+              <w:rPr>
+                <w:rtl w:val="1"/>
+              </w:rPr>
+            </w:r>
+            <w:r>
+              <w:rPr>
+                <w:sz w:val="17"/>
+                <w:rtl w:val="1"/>
+              </w:rPr>
+              <w:t>Õ(D)</w:t>
+            </w:r>
+          </w:p>
+        </w:tc>
+        <w:tc>
+          <w:tcPr>
+            <w:tcW w:type="dxa" w:w="1728"/>
+          </w:tcPr>
+          <w:p>
+            <w:pPr>
+              <w:bidi/>
+              <w:jc w:val="right"/>
+            </w:pPr>
+            <w:r>
+              <w:rPr>
+                <w:rtl w:val="1"/>
+              </w:rPr>
+            </w:r>
+            <w:r>
+              <w:rPr>
+                <w:sz w:val="17"/>
+                <w:rtl w:val="1"/>
+              </w:rPr>
+              <w:t>O(plsc·max{|Σ|,M} + √(plsc·d) + pocc)</w:t>
+            </w:r>
+          </w:p>
+        </w:tc>
+        <w:tc>
+          <w:tcPr>
+            <w:tcW w:type="dxa" w:w="1728"/>
+          </w:tcPr>
+          <w:p>
+            <w:pPr>
+              <w:bidi/>
+              <w:jc w:val="right"/>
+            </w:pPr>
+            <w:r>
+              <w:rPr>
+                <w:rtl w:val="1"/>
+              </w:rPr>
+            </w:r>
+            <w:r>
+              <w:rPr>
+                <w:sz w:val="17"/>
+                <w:rtl w:val="1"/>
+              </w:rPr>
+              <w:t>Õ(D + plsc(β+M))</w:t>
+            </w:r>
+          </w:p>
+        </w:tc>
+      </w:tr>
+      <w:tr>
+        <w:tc>
+          <w:tcPr>
+            <w:tcW w:type="dxa" w:w="1728"/>
+          </w:tcPr>
+          <w:p>
+            <w:pPr>
+              <w:bidi/>
+              <w:jc w:val="right"/>
+            </w:pPr>
+            <w:r>
+              <w:rPr>
+                <w:rtl w:val="1"/>
+              </w:rPr>
+            </w:r>
+            <w:r>
+              <w:rPr>
+                <w:sz w:val="17"/>
+                <w:rtl w:val="1"/>
+              </w:rPr>
+              <w:t>משפט 2</w:t>
+            </w:r>
+          </w:p>
+        </w:tc>
+        <w:tc>
+          <w:tcPr>
+            <w:tcW w:type="dxa" w:w="1728"/>
+          </w:tcPr>
+          <w:p>
+            <w:pPr>
+              <w:bidi/>
+              <w:jc w:val="right"/>
+            </w:pPr>
+            <w:r>
+              <w:rPr>
+                <w:rtl w:val="1"/>
+              </w:rPr>
+            </w:r>
+            <w:r>
+              <w:rPr>
+                <w:sz w:val="17"/>
+                <w:rtl w:val="1"/>
+              </w:rPr>
+              <w:t>PDMOG צפוף, לא-אחיד</w:t>
+            </w:r>
+          </w:p>
+        </w:tc>
+        <w:tc>
+          <w:tcPr>
+            <w:tcW w:type="dxa" w:w="1728"/>
+          </w:tcPr>
+          <w:p>
+            <w:pPr>
+              <w:bidi/>
+              <w:jc w:val="right"/>
+            </w:pPr>
+            <w:r>
+              <w:rPr>
+                <w:rtl w:val="1"/>
+              </w:rPr>
+            </w:r>
+            <w:r>
+              <w:rPr>
+                <w:sz w:val="17"/>
+                <w:rtl w:val="1"/>
+              </w:rPr>
+              <w:t>Õ(D + d(β*−α*))</w:t>
+            </w:r>
+          </w:p>
+        </w:tc>
+        <w:tc>
+          <w:tcPr>
+            <w:tcW w:type="dxa" w:w="1728"/>
+          </w:tcPr>
+          <w:p>
+            <w:pPr>
+              <w:bidi/>
+              <w:jc w:val="right"/>
+            </w:pPr>
+            <w:r>
+              <w:rPr>
+                <w:rtl w:val="1"/>
+              </w:rPr>
+            </w:r>
+            <w:r>
+              <w:rPr>
+                <w:sz w:val="17"/>
+                <w:rtl w:val="1"/>
+              </w:rPr>
+              <w:t>Õ(plsc·max{|Σ|,M} + √(plsc·d(β*−α*+M)) + pocc)</w:t>
+            </w:r>
+          </w:p>
+        </w:tc>
+        <w:tc>
+          <w:tcPr>
+            <w:tcW w:type="dxa" w:w="1728"/>
+          </w:tcPr>
+          <w:p>
+            <w:pPr>
+              <w:bidi/>
+              <w:jc w:val="right"/>
+            </w:pPr>
+            <w:r>
+              <w:rPr>
+                <w:rtl w:val="1"/>
+              </w:rPr>
+            </w:r>
+            <w:r>
+              <w:rPr>
+                <w:sz w:val="17"/>
+                <w:rtl w:val="1"/>
+              </w:rPr>
+              <w:t>Õ(D + d(β*−α*) + √(plsc·d)(β*+M))</w:t>
+            </w:r>
+          </w:p>
+        </w:tc>
+      </w:tr>
+      <w:tr>
+        <w:tc>
+          <w:tcPr>
+            <w:tcW w:type="dxa" w:w="1728"/>
+          </w:tcPr>
+          <w:p>
+            <w:pPr>
+              <w:bidi/>
+              <w:jc w:val="right"/>
+            </w:pPr>
+            <w:r>
+              <w:rPr>
+                <w:rtl w:val="1"/>
+              </w:rPr>
+            </w:r>
+            <w:r>
+              <w:rPr>
+                <w:sz w:val="17"/>
+                <w:rtl w:val="1"/>
+              </w:rPr>
+              <w:t>משפט 3</w:t>
+            </w:r>
+          </w:p>
+        </w:tc>
+        <w:tc>
+          <w:tcPr>
+            <w:tcW w:type="dxa" w:w="1728"/>
+          </w:tcPr>
+          <w:p>
+            <w:pPr>
+              <w:bidi/>
+              <w:jc w:val="right"/>
+            </w:pPr>
+            <w:r>
+              <w:rPr>
+                <w:rtl w:val="1"/>
+              </w:rPr>
+            </w:r>
+            <w:r>
+              <w:rPr>
+                <w:sz w:val="17"/>
+                <w:rtl w:val="1"/>
+              </w:rPr>
+              <w:t>strict רווי-אלפבית, אחיד</w:t>
+            </w:r>
+          </w:p>
+        </w:tc>
+        <w:tc>
+          <w:tcPr>
+            <w:tcW w:type="dxa" w:w="1728"/>
+          </w:tcPr>
+          <w:p>
+            <w:pPr>
+              <w:bidi/>
+              <w:jc w:val="right"/>
+            </w:pPr>
+            <w:r>
+              <w:rPr>
+                <w:rtl w:val="1"/>
+              </w:rPr>
+            </w:r>
+            <w:r>
+              <w:rPr>
+                <w:sz w:val="17"/>
+                <w:rtl w:val="1"/>
+              </w:rPr>
+              <w:t>O(D·log|Σ|)</w:t>
+            </w:r>
+          </w:p>
+        </w:tc>
+        <w:tc>
+          <w:tcPr>
+            <w:tcW w:type="dxa" w:w="1728"/>
+          </w:tcPr>
+          <w:p>
+            <w:pPr>
+              <w:bidi/>
+              <w:jc w:val="right"/>
+            </w:pPr>
+            <w:r>
+              <w:rPr>
+                <w:rtl w:val="1"/>
+              </w:rPr>
+            </w:r>
+            <w:r>
+              <w:rPr>
+                <w:sz w:val="17"/>
+                <w:rtl w:val="1"/>
+              </w:rPr>
+              <w:t>O(plsc·δ·log(|Σ|log|Σ|) + plsc·M + pocc)</w:t>
+            </w:r>
+          </w:p>
+        </w:tc>
+        <w:tc>
+          <w:tcPr>
+            <w:tcW w:type="dxa" w:w="1728"/>
+          </w:tcPr>
+          <w:p>
+            <w:pPr>
+              <w:bidi/>
+              <w:jc w:val="right"/>
+            </w:pPr>
+            <w:r>
+              <w:rPr>
+                <w:rtl w:val="1"/>
+              </w:rPr>
+            </w:r>
+            <w:r>
+              <w:rPr>
+                <w:sz w:val="17"/>
+                <w:rtl w:val="1"/>
+              </w:rPr>
+              <w:t>O(D·logD + δ·plsc·|Σ|(β−α+M) + plsc·|Σ|·α)</w:t>
+            </w:r>
+          </w:p>
+        </w:tc>
+      </w:tr>
+      <w:tr>
+        <w:tc>
+          <w:tcPr>
+            <w:tcW w:type="dxa" w:w="1728"/>
+          </w:tcPr>
+          <w:p>
+            <w:pPr>
+              <w:bidi/>
+              <w:jc w:val="right"/>
+            </w:pPr>
+            <w:r>
+              <w:rPr>
+                <w:rtl w:val="1"/>
+              </w:rPr>
+            </w:r>
+            <w:r>
+              <w:rPr>
+                <w:sz w:val="17"/>
+                <w:rtl w:val="1"/>
+              </w:rPr>
+              <w:t>משפט 4</w:t>
+            </w:r>
+          </w:p>
+        </w:tc>
+        <w:tc>
+          <w:tcPr>
+            <w:tcW w:type="dxa" w:w="1728"/>
+          </w:tcPr>
+          <w:p>
+            <w:pPr>
+              <w:bidi/>
+              <w:jc w:val="right"/>
+            </w:pPr>
+            <w:r>
+              <w:rPr>
+                <w:rtl w:val="1"/>
+              </w:rPr>
+            </w:r>
+            <w:r>
+              <w:rPr>
+                <w:sz w:val="17"/>
+                <w:rtl w:val="1"/>
+              </w:rPr>
+              <w:t>strict רווי-אלפבית, לא-אחיד</w:t>
+            </w:r>
+          </w:p>
+        </w:tc>
+        <w:tc>
+          <w:tcPr>
+            <w:tcW w:type="dxa" w:w="1728"/>
+          </w:tcPr>
+          <w:p>
+            <w:pPr>
+              <w:bidi/>
+              <w:jc w:val="right"/>
+            </w:pPr>
+            <w:r>
+              <w:rPr>
+                <w:rtl w:val="1"/>
+              </w:rPr>
+            </w:r>
+            <w:r>
+              <w:rPr>
+                <w:sz w:val="17"/>
+                <w:rtl w:val="1"/>
+              </w:rPr>
+              <w:t>Õ(D)</w:t>
+            </w:r>
+          </w:p>
+        </w:tc>
+        <w:tc>
+          <w:tcPr>
+            <w:tcW w:type="dxa" w:w="1728"/>
+          </w:tcPr>
+          <w:p>
+            <w:pPr>
+              <w:bidi/>
+              <w:jc w:val="right"/>
+            </w:pPr>
+            <w:r>
+              <w:rPr>
+                <w:rtl w:val="1"/>
+              </w:rPr>
+            </w:r>
+            <w:r>
+              <w:rPr>
+                <w:sz w:val="17"/>
+                <w:rtl w:val="1"/>
+              </w:rPr>
+              <w:t>Õ(plsc·δ + plsc·M + pocc)</w:t>
+            </w:r>
+          </w:p>
+        </w:tc>
+        <w:tc>
+          <w:tcPr>
+            <w:tcW w:type="dxa" w:w="1728"/>
+          </w:tcPr>
+          <w:p>
+            <w:pPr>
+              <w:bidi/>
+              <w:jc w:val="right"/>
+            </w:pPr>
+            <w:r>
+              <w:rPr>
+                <w:rtl w:val="1"/>
+              </w:rPr>
+            </w:r>
+            <w:r>
+              <w:rPr>
+                <w:sz w:val="17"/>
+                <w:rtl w:val="1"/>
+              </w:rPr>
+              <w:t>Õ(D + plsc·δ(β*−α*+M) + plsc·α*)</w:t>
+            </w:r>
+          </w:p>
+        </w:tc>
+      </w:tr>
+    </w:tbl>
+    <w:p>
+      <w:pPr>
+        <w:bidi/>
+        <w:jc w:val="right"/>
+      </w:pPr>
+      <w:r>
+        <w:rPr>
+          <w:b w:val="0"/>
+          <w:i w:val="0"/>
+          <w:rtl w:val="1"/>
+        </w:rPr>
+      </w:r>
+    </w:p>
+    <w:p>
+      <w:pPr>
+        <w:bidi/>
+        <w:jc w:val="right"/>
+      </w:pPr>
+      <w:r>
+        <w:rPr>
+          <w:b w:val="0"/>
+          <w:i/>
+          <w:sz w:val="18"/>
+          <w:rtl w:val="1"/>
+        </w:rPr>
+        <w:t>קיצורים: δ = δ(G_D) ניוון הגרף; plsc = שרשרת ה-p-סיומות הארוכה; |Σ| = גודל האלפבית; M = תת-התבנית הימנית הארוכה; β,α = גבולות רווח (אחיד); β*,α* = הקיצון (לא-אחיד); d = מספר התבניות; D = גודל המילון.</w:t>
       </w:r>
     </w:p>
     <w:sectPr>

</xml_diff>